<commit_message>
members collection: removed all records
</commit_message>
<xml_diff>
--- a/SQL Queries.docx
+++ b/SQL Queries.docx
@@ -724,6 +724,606 @@
         </w:rPr>
         <w:t>print_section("COLLECTION_CODES", collection_codes)</w:t>
       </w:r>
+    </w:p>
+    <w:p>
+      <w:pPr>
+        <w:shd w:val="clear" w:color="auto" w:fill="121314"/>
+        <w:spacing w:after="0" w:line="300" w:lineRule="atLeast"/>
+        <w:rPr>
+          <w:rFonts w:ascii="Consolas" w:eastAsia="Times New Roman" w:hAnsi="Consolas" w:cs="Times New Roman"/>
+          <w:color w:val="BBBEBF"/>
+          <w:sz w:val="21"/>
+          <w:szCs w:val="21"/>
+          <w:lang/>
+        </w:rPr>
+      </w:pPr>
+      <w:r>
+        <w:rPr>
+          <w:rFonts w:ascii="Consolas" w:eastAsia="Times New Roman" w:hAnsi="Consolas" w:cs="Times New Roman"/>
+          <w:color w:val="A5D6FF"/>
+          <w:sz w:val="21"/>
+          <w:szCs w:val="21"/>
+          <w:lang/>
+        </w:rPr>
+        <w:t>print_section("MEMBERS_COLLECTION (latest 200)", members_collection)</w:t>
+      </w:r>
+    </w:p>
+    <w:p>
+      <w:pPr>
+        <w:shd w:val="clear" w:color="auto" w:fill="121314"/>
+        <w:spacing w:after="0" w:line="300" w:lineRule="atLeast"/>
+        <w:rPr>
+          <w:rFonts w:ascii="Consolas" w:eastAsia="Times New Roman" w:hAnsi="Consolas" w:cs="Times New Roman"/>
+          <w:color w:val="BBBEBF"/>
+          <w:sz w:val="21"/>
+          <w:szCs w:val="21"/>
+          <w:lang/>
+        </w:rPr>
+      </w:pPr>
+      <w:r>
+        <w:rPr>
+          <w:rFonts w:ascii="Consolas" w:eastAsia="Times New Roman" w:hAnsi="Consolas" w:cs="Times New Roman"/>
+          <w:color w:val="BBBEBF"/>
+          <w:sz w:val="21"/>
+          <w:szCs w:val="21"/>
+          <w:lang/>
+        </w:rPr>
+        <w:t>PY</w:t>
+      </w:r>
+    </w:p>
+    <w:p/>
+    <w:p/>
+    <w:p/>
+    <w:p/>
+    <w:p>
+      <w:pPr>
+        <w:shd w:val="clear" w:color="auto" w:fill="121314"/>
+        <w:spacing w:after="0" w:line="300" w:lineRule="atLeast"/>
+        <w:rPr>
+          <w:rFonts w:ascii="Consolas" w:eastAsia="Times New Roman" w:hAnsi="Consolas" w:cs="Times New Roman"/>
+          <w:color w:val="BBBEBF"/>
+          <w:sz w:val="21"/>
+          <w:szCs w:val="21"/>
+          <w:lang/>
+        </w:rPr>
+      </w:pPr>
+      <w:r>
+        <w:rPr>
+          <w:rFonts w:ascii="Consolas" w:eastAsia="Times New Roman" w:hAnsi="Consolas" w:cs="Times New Roman"/>
+          <w:color w:val="FFA657"/>
+          <w:sz w:val="21"/>
+          <w:szCs w:val="21"/>
+          <w:lang/>
+        </w:rPr>
+        <w:t>python3</w:t>
+      </w:r>
+      <w:r>
+        <w:rPr>
+          <w:rFonts w:ascii="Consolas" w:eastAsia="Times New Roman" w:hAnsi="Consolas" w:cs="Times New Roman"/>
+          <w:color w:val="BBBEBF"/>
+          <w:sz w:val="21"/>
+          <w:szCs w:val="21"/>
+          <w:lang/>
+        </w:rPr>
+        <w:t xml:space="preserve"> </w:t>
+      </w:r>
+      <w:r>
+        <w:rPr>
+          <w:rFonts w:ascii="Consolas" w:eastAsia="Times New Roman" w:hAnsi="Consolas" w:cs="Times New Roman"/>
+          <w:color w:val="A5D6FF"/>
+          <w:sz w:val="21"/>
+          <w:szCs w:val="21"/>
+          <w:lang/>
+        </w:rPr>
+        <w:t>-</w:t>
+      </w:r>
+      <w:r>
+        <w:rPr>
+          <w:rFonts w:ascii="Consolas" w:eastAsia="Times New Roman" w:hAnsi="Consolas" w:cs="Times New Roman"/>
+          <w:color w:val="BBBEBF"/>
+          <w:sz w:val="21"/>
+          <w:szCs w:val="21"/>
+          <w:lang/>
+        </w:rPr>
+        <w:t xml:space="preserve"> </w:t>
+      </w:r>
+      <w:r>
+        <w:rPr>
+          <w:rFonts w:ascii="Consolas" w:eastAsia="Times New Roman" w:hAnsi="Consolas" w:cs="Times New Roman"/>
+          <w:color w:val="D4D4D4"/>
+          <w:sz w:val="21"/>
+          <w:szCs w:val="21"/>
+          <w:lang/>
+        </w:rPr>
+        <w:t>&lt;&lt;</w:t>
+      </w:r>
+      <w:r>
+        <w:rPr>
+          <w:rFonts w:ascii="Consolas" w:eastAsia="Times New Roman" w:hAnsi="Consolas" w:cs="Times New Roman"/>
+          <w:color w:val="BBBEBF"/>
+          <w:sz w:val="21"/>
+          <w:szCs w:val="21"/>
+          <w:lang/>
+        </w:rPr>
+        <w:t>'PY'</w:t>
+      </w:r>
+    </w:p>
+    <w:p>
+      <w:pPr>
+        <w:shd w:val="clear" w:color="auto" w:fill="121314"/>
+        <w:spacing w:after="0" w:line="300" w:lineRule="atLeast"/>
+        <w:rPr>
+          <w:rFonts w:ascii="Consolas" w:eastAsia="Times New Roman" w:hAnsi="Consolas" w:cs="Times New Roman"/>
+          <w:color w:val="BBBEBF"/>
+          <w:sz w:val="21"/>
+          <w:szCs w:val="21"/>
+          <w:lang/>
+        </w:rPr>
+      </w:pPr>
+      <w:r>
+        <w:rPr>
+          <w:rFonts w:ascii="Consolas" w:eastAsia="Times New Roman" w:hAnsi="Consolas" w:cs="Times New Roman"/>
+          <w:color w:val="A5D6FF"/>
+          <w:sz w:val="21"/>
+          <w:szCs w:val="21"/>
+          <w:lang/>
+        </w:rPr>
+        <w:t>from sqlalchemy import text</w:t>
+      </w:r>
+    </w:p>
+    <w:p>
+      <w:pPr>
+        <w:shd w:val="clear" w:color="auto" w:fill="121314"/>
+        <w:spacing w:after="0" w:line="300" w:lineRule="atLeast"/>
+        <w:rPr>
+          <w:rFonts w:ascii="Consolas" w:eastAsia="Times New Roman" w:hAnsi="Consolas" w:cs="Times New Roman"/>
+          <w:color w:val="BBBEBF"/>
+          <w:sz w:val="21"/>
+          <w:szCs w:val="21"/>
+          <w:lang/>
+        </w:rPr>
+      </w:pPr>
+      <w:r>
+        <w:rPr>
+          <w:rFonts w:ascii="Consolas" w:eastAsia="Times New Roman" w:hAnsi="Consolas" w:cs="Times New Roman"/>
+          <w:color w:val="A5D6FF"/>
+          <w:sz w:val="21"/>
+          <w:szCs w:val="21"/>
+          <w:lang/>
+        </w:rPr>
+        <w:t>from backend.db import engine</w:t>
+      </w:r>
+    </w:p>
+    <w:p>
+      <w:pPr>
+        <w:shd w:val="clear" w:color="auto" w:fill="121314"/>
+        <w:spacing w:after="0" w:line="300" w:lineRule="atLeast"/>
+        <w:rPr>
+          <w:rFonts w:ascii="Consolas" w:eastAsia="Times New Roman" w:hAnsi="Consolas" w:cs="Times New Roman"/>
+          <w:color w:val="BBBEBF"/>
+          <w:sz w:val="21"/>
+          <w:szCs w:val="21"/>
+          <w:lang/>
+        </w:rPr>
+      </w:pPr>
+    </w:p>
+    <w:p>
+      <w:pPr>
+        <w:shd w:val="clear" w:color="auto" w:fill="121314"/>
+        <w:spacing w:after="0" w:line="300" w:lineRule="atLeast"/>
+        <w:rPr>
+          <w:rFonts w:ascii="Consolas" w:eastAsia="Times New Roman" w:hAnsi="Consolas" w:cs="Times New Roman"/>
+          <w:color w:val="BBBEBF"/>
+          <w:sz w:val="21"/>
+          <w:szCs w:val="21"/>
+          <w:lang/>
+        </w:rPr>
+      </w:pPr>
+      <w:r>
+        <w:rPr>
+          <w:rFonts w:ascii="Consolas" w:eastAsia="Times New Roman" w:hAnsi="Consolas" w:cs="Times New Roman"/>
+          <w:color w:val="A5D6FF"/>
+          <w:sz w:val="21"/>
+          <w:szCs w:val="21"/>
+          <w:lang/>
+        </w:rPr>
+        <w:t>def print_section(title, rows):</w:t>
+      </w:r>
+    </w:p>
+    <w:p>
+      <w:pPr>
+        <w:shd w:val="clear" w:color="auto" w:fill="121314"/>
+        <w:spacing w:after="0" w:line="300" w:lineRule="atLeast"/>
+        <w:rPr>
+          <w:rFonts w:ascii="Consolas" w:eastAsia="Times New Roman" w:hAnsi="Consolas" w:cs="Times New Roman"/>
+          <w:color w:val="BBBEBF"/>
+          <w:sz w:val="21"/>
+          <w:szCs w:val="21"/>
+          <w:lang/>
+        </w:rPr>
+      </w:pPr>
+      <w:r>
+        <w:rPr>
+          <w:rFonts w:ascii="Consolas" w:eastAsia="Times New Roman" w:hAnsi="Consolas" w:cs="Times New Roman"/>
+          <w:color w:val="A5D6FF"/>
+          <w:sz w:val="21"/>
+          <w:szCs w:val="21"/>
+          <w:lang/>
+        </w:rPr>
+        <w:t>    print("\n" + "=" * 90)</w:t>
+      </w:r>
+    </w:p>
+    <w:p>
+      <w:pPr>
+        <w:shd w:val="clear" w:color="auto" w:fill="121314"/>
+        <w:spacing w:after="0" w:line="300" w:lineRule="atLeast"/>
+        <w:rPr>
+          <w:rFonts w:ascii="Consolas" w:eastAsia="Times New Roman" w:hAnsi="Consolas" w:cs="Times New Roman"/>
+          <w:color w:val="BBBEBF"/>
+          <w:sz w:val="21"/>
+          <w:szCs w:val="21"/>
+          <w:lang/>
+        </w:rPr>
+      </w:pPr>
+      <w:r>
+        <w:rPr>
+          <w:rFonts w:ascii="Consolas" w:eastAsia="Times New Roman" w:hAnsi="Consolas" w:cs="Times New Roman"/>
+          <w:color w:val="A5D6FF"/>
+          <w:sz w:val="21"/>
+          <w:szCs w:val="21"/>
+          <w:lang/>
+        </w:rPr>
+        <w:t>    print(title)</w:t>
+      </w:r>
+    </w:p>
+    <w:p>
+      <w:pPr>
+        <w:shd w:val="clear" w:color="auto" w:fill="121314"/>
+        <w:spacing w:after="0" w:line="300" w:lineRule="atLeast"/>
+        <w:rPr>
+          <w:rFonts w:ascii="Consolas" w:eastAsia="Times New Roman" w:hAnsi="Consolas" w:cs="Times New Roman"/>
+          <w:color w:val="BBBEBF"/>
+          <w:sz w:val="21"/>
+          <w:szCs w:val="21"/>
+          <w:lang/>
+        </w:rPr>
+      </w:pPr>
+      <w:r>
+        <w:rPr>
+          <w:rFonts w:ascii="Consolas" w:eastAsia="Times New Roman" w:hAnsi="Consolas" w:cs="Times New Roman"/>
+          <w:color w:val="A5D6FF"/>
+          <w:sz w:val="21"/>
+          <w:szCs w:val="21"/>
+          <w:lang/>
+        </w:rPr>
+        <w:lastRenderedPageBreak/>
+        <w:t>    print("=" * 90)</w:t>
+      </w:r>
+    </w:p>
+    <w:p>
+      <w:pPr>
+        <w:shd w:val="clear" w:color="auto" w:fill="121314"/>
+        <w:spacing w:after="0" w:line="300" w:lineRule="atLeast"/>
+        <w:rPr>
+          <w:rFonts w:ascii="Consolas" w:eastAsia="Times New Roman" w:hAnsi="Consolas" w:cs="Times New Roman"/>
+          <w:color w:val="BBBEBF"/>
+          <w:sz w:val="21"/>
+          <w:szCs w:val="21"/>
+          <w:lang/>
+        </w:rPr>
+      </w:pPr>
+      <w:r>
+        <w:rPr>
+          <w:rFonts w:ascii="Consolas" w:eastAsia="Times New Roman" w:hAnsi="Consolas" w:cs="Times New Roman"/>
+          <w:color w:val="A5D6FF"/>
+          <w:sz w:val="21"/>
+          <w:szCs w:val="21"/>
+          <w:lang/>
+        </w:rPr>
+        <w:t>    for row in rows:</w:t>
+      </w:r>
+    </w:p>
+    <w:p>
+      <w:pPr>
+        <w:shd w:val="clear" w:color="auto" w:fill="121314"/>
+        <w:spacing w:after="0" w:line="300" w:lineRule="atLeast"/>
+        <w:rPr>
+          <w:rFonts w:ascii="Consolas" w:eastAsia="Times New Roman" w:hAnsi="Consolas" w:cs="Times New Roman"/>
+          <w:color w:val="BBBEBF"/>
+          <w:sz w:val="21"/>
+          <w:szCs w:val="21"/>
+          <w:lang/>
+        </w:rPr>
+      </w:pPr>
+      <w:r>
+        <w:rPr>
+          <w:rFonts w:ascii="Consolas" w:eastAsia="Times New Roman" w:hAnsi="Consolas" w:cs="Times New Roman"/>
+          <w:color w:val="A5D6FF"/>
+          <w:sz w:val="21"/>
+          <w:szCs w:val="21"/>
+          <w:lang/>
+        </w:rPr>
+        <w:t>        print(dict(row._mapping))</w:t>
+      </w:r>
+    </w:p>
+    <w:p>
+      <w:pPr>
+        <w:shd w:val="clear" w:color="auto" w:fill="121314"/>
+        <w:spacing w:after="0" w:line="300" w:lineRule="atLeast"/>
+        <w:rPr>
+          <w:rFonts w:ascii="Consolas" w:eastAsia="Times New Roman" w:hAnsi="Consolas" w:cs="Times New Roman"/>
+          <w:color w:val="BBBEBF"/>
+          <w:sz w:val="21"/>
+          <w:szCs w:val="21"/>
+          <w:lang/>
+        </w:rPr>
+      </w:pPr>
+      <w:r>
+        <w:rPr>
+          <w:rFonts w:ascii="Consolas" w:eastAsia="Times New Roman" w:hAnsi="Consolas" w:cs="Times New Roman"/>
+          <w:color w:val="A5D6FF"/>
+          <w:sz w:val="21"/>
+          <w:szCs w:val="21"/>
+          <w:lang/>
+        </w:rPr>
+        <w:t>    print(f"Total rows: {len(rows)}")</w:t>
+      </w:r>
+    </w:p>
+    <w:p>
+      <w:pPr>
+        <w:shd w:val="clear" w:color="auto" w:fill="121314"/>
+        <w:spacing w:after="0" w:line="300" w:lineRule="atLeast"/>
+        <w:rPr>
+          <w:rFonts w:ascii="Consolas" w:eastAsia="Times New Roman" w:hAnsi="Consolas" w:cs="Times New Roman"/>
+          <w:color w:val="BBBEBF"/>
+          <w:sz w:val="21"/>
+          <w:szCs w:val="21"/>
+          <w:lang/>
+        </w:rPr>
+      </w:pPr>
+    </w:p>
+    <w:p>
+      <w:pPr>
+        <w:shd w:val="clear" w:color="auto" w:fill="121314"/>
+        <w:spacing w:after="0" w:line="300" w:lineRule="atLeast"/>
+        <w:rPr>
+          <w:rFonts w:ascii="Consolas" w:eastAsia="Times New Roman" w:hAnsi="Consolas" w:cs="Times New Roman"/>
+          <w:color w:val="BBBEBF"/>
+          <w:sz w:val="21"/>
+          <w:szCs w:val="21"/>
+          <w:lang/>
+        </w:rPr>
+      </w:pPr>
+      <w:r>
+        <w:rPr>
+          <w:rFonts w:ascii="Consolas" w:eastAsia="Times New Roman" w:hAnsi="Consolas" w:cs="Times New Roman"/>
+          <w:color w:val="A5D6FF"/>
+          <w:sz w:val="21"/>
+          <w:szCs w:val="21"/>
+          <w:lang/>
+        </w:rPr>
+        <w:t>with engine.connect() as conn:</w:t>
+      </w:r>
+    </w:p>
+    <w:p>
+      <w:pPr>
+        <w:shd w:val="clear" w:color="auto" w:fill="121314"/>
+        <w:spacing w:after="0" w:line="300" w:lineRule="atLeast"/>
+        <w:rPr>
+          <w:rFonts w:ascii="Consolas" w:eastAsia="Times New Roman" w:hAnsi="Consolas" w:cs="Times New Roman"/>
+          <w:color w:val="BBBEBF"/>
+          <w:sz w:val="21"/>
+          <w:szCs w:val="21"/>
+          <w:lang/>
+        </w:rPr>
+      </w:pPr>
+    </w:p>
+    <w:p>
+      <w:pPr>
+        <w:shd w:val="clear" w:color="auto" w:fill="121314"/>
+        <w:spacing w:after="0" w:line="300" w:lineRule="atLeast"/>
+        <w:rPr>
+          <w:rFonts w:ascii="Consolas" w:eastAsia="Times New Roman" w:hAnsi="Consolas" w:cs="Times New Roman"/>
+          <w:color w:val="BBBEBF"/>
+          <w:sz w:val="21"/>
+          <w:szCs w:val="21"/>
+          <w:lang/>
+        </w:rPr>
+      </w:pPr>
+      <w:r>
+        <w:rPr>
+          <w:rFonts w:ascii="Consolas" w:eastAsia="Times New Roman" w:hAnsi="Consolas" w:cs="Times New Roman"/>
+          <w:color w:val="A5D6FF"/>
+          <w:sz w:val="21"/>
+          <w:szCs w:val="21"/>
+          <w:lang/>
+        </w:rPr>
+        <w:t>    members_collection = conn.execute(text("""</w:t>
+      </w:r>
+    </w:p>
+    <w:p>
+      <w:pPr>
+        <w:shd w:val="clear" w:color="auto" w:fill="121314"/>
+        <w:spacing w:after="0" w:line="300" w:lineRule="atLeast"/>
+        <w:rPr>
+          <w:rFonts w:ascii="Consolas" w:eastAsia="Times New Roman" w:hAnsi="Consolas" w:cs="Times New Roman"/>
+          <w:color w:val="A5D6FF"/>
+          <w:sz w:val="21"/>
+          <w:szCs w:val="21"/>
+          <w:lang w:val="en-GB"/>
+        </w:rPr>
+      </w:pPr>
+      <w:r>
+        <w:rPr>
+          <w:rFonts w:ascii="Consolas" w:eastAsia="Times New Roman" w:hAnsi="Consolas" w:cs="Times New Roman"/>
+          <w:color w:val="A5D6FF"/>
+          <w:sz w:val="21"/>
+          <w:szCs w:val="21"/>
+          <w:lang/>
+        </w:rPr>
+        <w:t>        SELECT id, church, collection_code, member_id, s1, s2, s3, s4</w:t>
+      </w:r>
+      <w:r>
+        <w:rPr>
+          <w:rFonts w:ascii="Consolas" w:eastAsia="Times New Roman" w:hAnsi="Consolas" w:cs="Times New Roman"/>
+          <w:color w:val="A5D6FF"/>
+          <w:sz w:val="21"/>
+          <w:szCs w:val="21"/>
+          <w:lang w:val="en-GB"/>
+        </w:rPr>
+        <w:t>, s6, s7, s9, s10, s11, s12, s13, s14, l1, l2, l3, l4, l5, l6, l7, l8, l9, l10, l11, l12, l13, l14, l15, l16, l17, l18, l19, l20, l21, l22, l23, l24, l25, l26, l27, l28, l29, l30, l31, l32, l33, l34, l35, l36, l37, l38, l39, l40, l41,</w:t>
+      </w:r>
+    </w:p>
+    <w:p>
+      <w:pPr>
+        <w:shd w:val="clear" w:color="auto" w:fill="121314"/>
+        <w:spacing w:after="0" w:line="300" w:lineRule="atLeast"/>
+        <w:rPr>
+          <w:rFonts w:ascii="Consolas" w:eastAsia="Times New Roman" w:hAnsi="Consolas" w:cs="Times New Roman"/>
+          <w:color w:val="A5D6FF"/>
+          <w:sz w:val="21"/>
+          <w:szCs w:val="21"/>
+          <w:lang w:val="en-GB"/>
+        </w:rPr>
+      </w:pPr>
+      <w:r>
+        <w:rPr>
+          <w:rFonts w:ascii="Consolas" w:eastAsia="Times New Roman" w:hAnsi="Consolas" w:cs="Times New Roman"/>
+          <w:color w:val="A5D6FF"/>
+          <w:sz w:val="21"/>
+          <w:szCs w:val="21"/>
+          <w:lang w:val="en-GB"/>
+        </w:rPr>
+        <w:t>c1, c2, c3, c4, c5, c6, c7, c8, c9, c10, c11, c12, c13, c14, c15, c16, c17,</w:t>
+      </w:r>
+    </w:p>
+    <w:p>
+      <w:pPr>
+        <w:shd w:val="clear" w:color="auto" w:fill="121314"/>
+        <w:spacing w:after="0" w:line="300" w:lineRule="atLeast"/>
+        <w:rPr>
+          <w:rFonts w:ascii="Consolas" w:eastAsia="Times New Roman" w:hAnsi="Consolas" w:cs="Times New Roman"/>
+          <w:color w:val="BBBEBF"/>
+          <w:sz w:val="21"/>
+          <w:szCs w:val="21"/>
+          <w:lang w:val="en-GB"/>
+        </w:rPr>
+      </w:pPr>
+      <w:r>
+        <w:rPr>
+          <w:rFonts w:ascii="Consolas" w:eastAsia="Times New Roman" w:hAnsi="Consolas" w:cs="Times New Roman"/>
+          <w:color w:val="A5D6FF"/>
+          <w:sz w:val="21"/>
+          <w:szCs w:val="21"/>
+          <w:lang w:val="en-GB"/>
+        </w:rPr>
+        <w:t>c18, c19, c20</w:t>
+      </w:r>
+    </w:p>
+    <w:p>
+      <w:pPr>
+        <w:shd w:val="clear" w:color="auto" w:fill="121314"/>
+        <w:spacing w:after="0" w:line="300" w:lineRule="atLeast"/>
+        <w:rPr>
+          <w:rFonts w:ascii="Consolas" w:eastAsia="Times New Roman" w:hAnsi="Consolas" w:cs="Times New Roman"/>
+          <w:color w:val="BBBEBF"/>
+          <w:sz w:val="21"/>
+          <w:szCs w:val="21"/>
+          <w:lang/>
+        </w:rPr>
+      </w:pPr>
+      <w:r>
+        <w:rPr>
+          <w:rFonts w:ascii="Consolas" w:eastAsia="Times New Roman" w:hAnsi="Consolas" w:cs="Times New Roman"/>
+          <w:color w:val="A5D6FF"/>
+          <w:sz w:val="21"/>
+          <w:szCs w:val="21"/>
+          <w:lang/>
+        </w:rPr>
+        <w:t>        FROM members_collection</w:t>
+      </w:r>
+    </w:p>
+    <w:p>
+      <w:pPr>
+        <w:shd w:val="clear" w:color="auto" w:fill="121314"/>
+        <w:spacing w:after="0" w:line="300" w:lineRule="atLeast"/>
+        <w:rPr>
+          <w:rFonts w:ascii="Consolas" w:eastAsia="Times New Roman" w:hAnsi="Consolas" w:cs="Times New Roman"/>
+          <w:color w:val="BBBEBF"/>
+          <w:sz w:val="21"/>
+          <w:szCs w:val="21"/>
+          <w:lang/>
+        </w:rPr>
+      </w:pPr>
+      <w:r>
+        <w:rPr>
+          <w:rFonts w:ascii="Consolas" w:eastAsia="Times New Roman" w:hAnsi="Consolas" w:cs="Times New Roman"/>
+          <w:color w:val="A5D6FF"/>
+          <w:sz w:val="21"/>
+          <w:szCs w:val="21"/>
+          <w:lang/>
+        </w:rPr>
+        <w:t>        ORDER BY id DESC</w:t>
+      </w:r>
+    </w:p>
+    <w:p>
+      <w:pPr>
+        <w:shd w:val="clear" w:color="auto" w:fill="121314"/>
+        <w:spacing w:after="0" w:line="300" w:lineRule="atLeast"/>
+        <w:rPr>
+          <w:rFonts w:ascii="Consolas" w:eastAsia="Times New Roman" w:hAnsi="Consolas" w:cs="Times New Roman"/>
+          <w:color w:val="BBBEBF"/>
+          <w:sz w:val="21"/>
+          <w:szCs w:val="21"/>
+          <w:lang/>
+        </w:rPr>
+      </w:pPr>
+      <w:r>
+        <w:rPr>
+          <w:rFonts w:ascii="Consolas" w:eastAsia="Times New Roman" w:hAnsi="Consolas" w:cs="Times New Roman"/>
+          <w:color w:val="A5D6FF"/>
+          <w:sz w:val="21"/>
+          <w:szCs w:val="21"/>
+          <w:lang/>
+        </w:rPr>
+        <w:t>        LIMIT 20</w:t>
+      </w:r>
+    </w:p>
+    <w:p>
+      <w:pPr>
+        <w:shd w:val="clear" w:color="auto" w:fill="121314"/>
+        <w:spacing w:after="0" w:line="300" w:lineRule="atLeast"/>
+        <w:rPr>
+          <w:rFonts w:ascii="Consolas" w:eastAsia="Times New Roman" w:hAnsi="Consolas" w:cs="Times New Roman"/>
+          <w:color w:val="BBBEBF"/>
+          <w:sz w:val="21"/>
+          <w:szCs w:val="21"/>
+          <w:lang/>
+        </w:rPr>
+      </w:pPr>
+      <w:r>
+        <w:rPr>
+          <w:rFonts w:ascii="Consolas" w:eastAsia="Times New Roman" w:hAnsi="Consolas" w:cs="Times New Roman"/>
+          <w:color w:val="A5D6FF"/>
+          <w:sz w:val="21"/>
+          <w:szCs w:val="21"/>
+          <w:lang/>
+        </w:rPr>
+        <w:t>    """)).fetchall()</w:t>
+      </w:r>
+    </w:p>
+    <w:p>
+      <w:pPr>
+        <w:shd w:val="clear" w:color="auto" w:fill="121314"/>
+        <w:spacing w:after="0" w:line="300" w:lineRule="atLeast"/>
+        <w:rPr>
+          <w:rFonts w:ascii="Consolas" w:eastAsia="Times New Roman" w:hAnsi="Consolas" w:cs="Times New Roman"/>
+          <w:color w:val="BBBEBF"/>
+          <w:sz w:val="21"/>
+          <w:szCs w:val="21"/>
+          <w:lang/>
+        </w:rPr>
+      </w:pPr>
     </w:p>
     <w:p>
       <w:pPr>

</xml_diff>